<commit_message>
DIP-50: Narrow AI design to route drafts and update technology comparison
</commit_message>
<xml_diff>
--- a/docs/technology-comparison-client-ai.docx
+++ b/docs/technology-comparison-client-ai.docx
@@ -105,7 +105,63 @@
           <w:sz w:val="24"/>
           <w:szCs w:val="24"/>
         </w:rPr>
-        <w:t xml:space="preserve">This document covers three of the key technical decisions: the client development framework (mobile and web), the AI approach for plan generation and the AI assistant, and the maps and places service. The server-side decisions (backend, database and component interaction) are covered by Aman Yerassyl in docs/backend-technology-comparison.md; the selected backend is Supabase (PostgreSQL). Each decision compares 2–3 realistic alternatives against criteria derived from the project requirements.</w:t>
+        <w:t xml:space="preserve"/>
+      </w:r>
+      <w:r>
+        <w:rPr>
+          <w:rFonts w:ascii="Times New Roman" w:cs="Times New Roman" w:eastAsia="Times New Roman" w:hAnsi="Times New Roman"/>
+          <w:b/>
+          <w:bCs/>
+          <w:sz w:val="24"/>
+          <w:szCs w:val="24"/>
+        </w:rPr>
+        <w:t xml:space="preserve">Revision:</w:t>
+      </w:r>
+      <w:r>
+        <w:rPr>
+          <w:rFonts w:ascii="Times New Roman" w:cs="Times New Roman" w:eastAsia="Times New Roman" w:hAnsi="Times New Roman"/>
+          <w:b w:val="false"/>
+          <w:bCs w:val="false"/>
+          <w:sz w:val="24"/>
+          <w:szCs w:val="24"/>
+        </w:rPr>
+        <w:t xml:space="preserve"> 24 October 2026. Updated for the five-outcome MVP that follows the supervisor's feedback of 23 October 2026. The decisions below are selected for implementation; </w:t>
+      </w:r>
+      <w:r>
+        <w:rPr>
+          <w:rFonts w:ascii="Times New Roman" w:cs="Times New Roman" w:eastAsia="Times New Roman" w:hAnsi="Times New Roman"/>
+          <w:b/>
+          <w:bCs/>
+          <w:sz w:val="24"/>
+          <w:szCs w:val="24"/>
+        </w:rPr>
+        <w:t xml:space="preserve">none of them is implemented or benchmarked yet</w:t>
+      </w:r>
+      <w:r>
+        <w:rPr>
+          <w:rFonts w:ascii="Times New Roman" w:cs="Times New Roman" w:eastAsia="Times New Roman" w:hAnsi="Times New Roman"/>
+          <w:b w:val="false"/>
+          <w:bCs w:val="false"/>
+          <w:sz w:val="24"/>
+          <w:szCs w:val="24"/>
+        </w:rPr>
+        <w:t xml:space="preserve">.</w:t>
+      </w:r>
+    </w:p>
+    <w:p>
+      <w:pPr>
+        <w:spacing w:after="120" w:line="300"/>
+        <w:jc w:val="both"/>
+      </w:pPr>
+      <w:r>
+        <w:rPr>
+          <w:rFonts w:ascii="Times New Roman" w:cs="Times New Roman" w:eastAsia="Times New Roman" w:hAnsi="Times New Roman"/>
+          <w:b w:val="false"/>
+          <w:bCs w:val="false"/>
+          <w:sz w:val="24"/>
+          <w:szCs w:val="24"/>
+        </w:rPr>
+        <w:t xml:space="preserve">This document covers three of the key technical decisions: the client development framework (mobile and web), the AI approach for route-draft generation (MVP outcome M2), and the maps and places service. The server-side decisions (backend, database and component interaction) are covered by Aman Yerassyl in docs/backend-technology-comparison.md; the selected backend is Supabase (PostgreSQL). Each decision compares 2–3 realistic alternatives against criteria derived from the project requirements.</w:t>
       </w:r>
     </w:p>
     <w:p>
@@ -158,7 +214,7 @@
           <w:sz w:val="24"/>
           <w:szCs w:val="24"/>
         </w:rPr>
-        <w:t xml:space="preserve"> one application for Android and iOS plus a web version (NFR-07), an interactive map (FR-07), real-time collaboration through the Supabase backend chosen in the server-side comparison, offline access (FR-18) and a realistic workload for a team of three students.</w:t>
+        <w:t xml:space="preserve"> one application for Android and iOS plus a web version (NFR-07), an interactive map (FR-07), shared editing and voting through the Supabase backend chosen in the server-side comparison (FR-05/08/09) and a realistic workload for a team of three students.</w:t>
       </w:r>
     </w:p>
     <w:p>
@@ -1381,7 +1437,7 @@
           <w:sz w:val="24"/>
           <w:szCs w:val="24"/>
         </w:rPr>
-        <w:t xml:space="preserve"> the plan must stay within the budget (FR-06), only existing places may be recommended (NFR-09), the plan must be generated in under 30 seconds (NFR-01), and the AI assistant must understand free-text requests (FR-12).</w:t>
+        <w:t xml:space="preserve"> the plan must stay within the budget (FR-06), only existing places may be recommended (NFR-09), the draft must be generated in under 30 seconds (NFR-01), and nothing may be saved before the user confirms the draft (FR-03). The conversational assistant (FR-12) is deferred and is not a criterion for this decision.</w:t>
       </w:r>
     </w:p>
     <w:p>
@@ -2429,7 +2485,7 @@
           <w:sz w:val="24"/>
           <w:szCs w:val="24"/>
         </w:rPr>
-        <w:t xml:space="preserve"> The LLM interprets the request, ranks candidate places and writes explanations; the candidate places come from our verified database; budget distribution and route ordering are calculated by code. This follows the evidence that LLMs alone fail on constrained travel planning [4] and that hybrid systems give better itineraries [7]. The concrete LLM provider will be chosen during development by testing 20 typical requests for quality, response time and cost; the API key will be stored only on the server (NFR-06).</w:t>
+        <w:t xml:space="preserve"> The LLM receives the trip parameters and a list of checked catalog candidates and returns a typed draft that references catalog IDs only; it never supplies prices or new IDs. Budget totals are calculated by code (the budget core, DIP-42), the draft is validated by code and revalidated by the server before the user's confirmation is saved. This follows the evidence that LLMs alone fail on constrained travel planning [4] and that hybrid systems give better itineraries [7]. The concrete LLM provider will be chosen during development by testing 20 typical requests for quality, response time and cost; the API key will be stored only on the server (NFR-06).</w:t>
       </w:r>
     </w:p>
     <w:p>
@@ -3445,7 +3501,7 @@
           <w:sz w:val="24"/>
           <w:szCs w:val="24"/>
         </w:rPr>
-        <w:t xml:space="preserve">3.1 Check of API Access for Astana (to do)</w:t>
+        <w:t xml:space="preserve">3.1 Check of API Access for Astana (not yet executed)</w:t>
       </w:r>
     </w:p>
     <w:p>
@@ -3509,6 +3565,39 @@
           <w:szCs w:val="24"/>
         </w:rPr>
         <w:t xml:space="preserve">Compare the results in a short table and attach screenshots in docs/evidence/. Confirm or change the decision above.</w:t>
+      </w:r>
+    </w:p>
+    <w:p>
+      <w:pPr>
+        <w:pStyle w:val="Heading1"/>
+        <w:keepNext/>
+        <w:spacing w:after="120" w:before="240"/>
+      </w:pPr>
+      <w:r>
+        <w:rPr>
+          <w:rFonts w:ascii="Times New Roman" w:cs="Times New Roman" w:eastAsia="Times New Roman" w:hAnsi="Times New Roman"/>
+          <w:b/>
+          <w:bCs/>
+          <w:sz w:val="28"/>
+          <w:szCs w:val="28"/>
+        </w:rPr>
+        <w:t xml:space="preserve">4. Implementation Status and Ownership</w:t>
+      </w:r>
+    </w:p>
+    <w:p>
+      <w:pPr>
+        <w:spacing w:after="120" w:line="300"/>
+        <w:jc w:val="both"/>
+      </w:pPr>
+      <w:r>
+        <w:rPr>
+          <w:rFonts w:ascii="Times New Roman" w:cs="Times New Roman" w:eastAsia="Times New Roman" w:hAnsi="Times New Roman"/>
+          <w:b w:val="false"/>
+          <w:bCs w:val="false"/>
+          <w:sz w:val="24"/>
+          <w:szCs w:val="24"/>
+        </w:rPr>
+        <w:t xml:space="preserve">These technologies are selected but not yet used in code. The Flutter shell, AI generation adapter and map integration are owned by Shauzat Sayakhat; the backend by Aman Yerassyl; the trip form, budget and editor by Kabysheva Zukhra (proposed split, pending review). The only implemented code is Zukhra's standalone Dart budget core, which can later be imported into the Flutter project.</w:t>
       </w:r>
     </w:p>
     <w:p>

</xml_diff>